<commit_message>
Fix: Se agregar columna 'comentario' para identificar los códigos 'matriz de riesgo' con códigos específicos
</commit_message>
<xml_diff>
--- a/Documentacion/Documentacion_Proyeccion_Compras.docx
+++ b/Documentacion/Documentacion_Proyeccion_Compras.docx
@@ -57,21 +57,7 @@
         <w:rPr>
           <w:color w:val="555555"/>
         </w:rPr>
-        <w:t xml:space="preserve">Versión funcional · </w:t>
-      </w:r>
-      <w:proofErr w:type="gramStart"/>
-      <w:r>
-        <w:rPr>
-          <w:color w:val="555555"/>
-        </w:rPr>
-        <w:t>Agosto</w:t>
-      </w:r>
-      <w:proofErr w:type="gramEnd"/>
-      <w:r>
-        <w:rPr>
-          <w:color w:val="555555"/>
-        </w:rPr>
-        <w:t xml:space="preserve"> 2026</w:t>
+        <w:t xml:space="preserve">Versión funcional · Agosto 2026</w:t>
       </w:r>
     </w:p>
     <w:p>
@@ -113,11 +99,7 @@
           </w:pPr>
           <w:r>
             <w:fldChar w:fldCharType="begin"/>
-          </w:r>
-          <w:r>
             <w:instrText>TOC \h \o "1-2"</w:instrText>
-          </w:r>
-          <w:r>
             <w:fldChar w:fldCharType="separate"/>
           </w:r>
           <w:hyperlink w:anchor="_Toc238017016" w:history="1">
@@ -135,40 +117,10 @@
                 <w:noProof/>
               </w:rPr>
               <w:tab/>
-            </w:r>
-            <w:r>
-              <w:rPr>
-                <w:noProof/>
-              </w:rPr>
               <w:fldChar w:fldCharType="begin"/>
-            </w:r>
-            <w:r>
-              <w:rPr>
-                <w:noProof/>
-              </w:rPr>
               <w:instrText xml:space="preserve"> PAGEREF _Toc238017016 \h </w:instrText>
-            </w:r>
-            <w:r>
-              <w:rPr>
-                <w:noProof/>
-              </w:rPr>
-            </w:r>
-            <w:r>
-              <w:rPr>
-                <w:noProof/>
-              </w:rPr>
               <w:fldChar w:fldCharType="separate"/>
-            </w:r>
-            <w:r>
-              <w:rPr>
-                <w:noProof/>
-              </w:rPr>
               <w:t>3</w:t>
-            </w:r>
-            <w:r>
-              <w:rPr>
-                <w:noProof/>
-              </w:rPr>
               <w:fldChar w:fldCharType="end"/>
             </w:r>
           </w:hyperlink>
@@ -198,40 +150,10 @@
                 <w:noProof/>
               </w:rPr>
               <w:tab/>
-            </w:r>
-            <w:r>
-              <w:rPr>
-                <w:noProof/>
-              </w:rPr>
               <w:fldChar w:fldCharType="begin"/>
-            </w:r>
-            <w:r>
-              <w:rPr>
-                <w:noProof/>
-              </w:rPr>
               <w:instrText xml:space="preserve"> PAGEREF _Toc238017017 \h </w:instrText>
-            </w:r>
-            <w:r>
-              <w:rPr>
-                <w:noProof/>
-              </w:rPr>
-            </w:r>
-            <w:r>
-              <w:rPr>
-                <w:noProof/>
-              </w:rPr>
               <w:fldChar w:fldCharType="separate"/>
-            </w:r>
-            <w:r>
-              <w:rPr>
-                <w:noProof/>
-              </w:rPr>
               <w:t>3</w:t>
-            </w:r>
-            <w:r>
-              <w:rPr>
-                <w:noProof/>
-              </w:rPr>
               <w:fldChar w:fldCharType="end"/>
             </w:r>
           </w:hyperlink>
@@ -261,40 +183,10 @@
                 <w:noProof/>
               </w:rPr>
               <w:tab/>
-            </w:r>
-            <w:r>
-              <w:rPr>
-                <w:noProof/>
-              </w:rPr>
               <w:fldChar w:fldCharType="begin"/>
-            </w:r>
-            <w:r>
-              <w:rPr>
-                <w:noProof/>
-              </w:rPr>
               <w:instrText xml:space="preserve"> PAGEREF _Toc238017018 \h </w:instrText>
-            </w:r>
-            <w:r>
-              <w:rPr>
-                <w:noProof/>
-              </w:rPr>
-            </w:r>
-            <w:r>
-              <w:rPr>
-                <w:noProof/>
-              </w:rPr>
               <w:fldChar w:fldCharType="separate"/>
-            </w:r>
-            <w:r>
-              <w:rPr>
-                <w:noProof/>
-              </w:rPr>
               <w:t>3</w:t>
-            </w:r>
-            <w:r>
-              <w:rPr>
-                <w:noProof/>
-              </w:rPr>
               <w:fldChar w:fldCharType="end"/>
             </w:r>
           </w:hyperlink>
@@ -324,40 +216,10 @@
                 <w:noProof/>
               </w:rPr>
               <w:tab/>
-            </w:r>
-            <w:r>
-              <w:rPr>
-                <w:noProof/>
-              </w:rPr>
               <w:fldChar w:fldCharType="begin"/>
-            </w:r>
-            <w:r>
-              <w:rPr>
-                <w:noProof/>
-              </w:rPr>
               <w:instrText xml:space="preserve"> PAGEREF _Toc238017019 \h </w:instrText>
-            </w:r>
-            <w:r>
-              <w:rPr>
-                <w:noProof/>
-              </w:rPr>
-            </w:r>
-            <w:r>
-              <w:rPr>
-                <w:noProof/>
-              </w:rPr>
               <w:fldChar w:fldCharType="separate"/>
-            </w:r>
-            <w:r>
-              <w:rPr>
-                <w:noProof/>
-              </w:rPr>
               <w:t>4</w:t>
-            </w:r>
-            <w:r>
-              <w:rPr>
-                <w:noProof/>
-              </w:rPr>
               <w:fldChar w:fldCharType="end"/>
             </w:r>
           </w:hyperlink>
@@ -387,40 +249,10 @@
                 <w:noProof/>
               </w:rPr>
               <w:tab/>
-            </w:r>
-            <w:r>
-              <w:rPr>
-                <w:noProof/>
-              </w:rPr>
               <w:fldChar w:fldCharType="begin"/>
-            </w:r>
-            <w:r>
-              <w:rPr>
-                <w:noProof/>
-              </w:rPr>
               <w:instrText xml:space="preserve"> PAGEREF _Toc238017020 \h </w:instrText>
-            </w:r>
-            <w:r>
-              <w:rPr>
-                <w:noProof/>
-              </w:rPr>
-            </w:r>
-            <w:r>
-              <w:rPr>
-                <w:noProof/>
-              </w:rPr>
               <w:fldChar w:fldCharType="separate"/>
-            </w:r>
-            <w:r>
-              <w:rPr>
-                <w:noProof/>
-              </w:rPr>
               <w:t>4</w:t>
-            </w:r>
-            <w:r>
-              <w:rPr>
-                <w:noProof/>
-              </w:rPr>
               <w:fldChar w:fldCharType="end"/>
             </w:r>
           </w:hyperlink>
@@ -450,40 +282,10 @@
                 <w:noProof/>
               </w:rPr>
               <w:tab/>
-            </w:r>
-            <w:r>
-              <w:rPr>
-                <w:noProof/>
-              </w:rPr>
               <w:fldChar w:fldCharType="begin"/>
-            </w:r>
-            <w:r>
-              <w:rPr>
-                <w:noProof/>
-              </w:rPr>
               <w:instrText xml:space="preserve"> PAGEREF _Toc238017021 \h </w:instrText>
-            </w:r>
-            <w:r>
-              <w:rPr>
-                <w:noProof/>
-              </w:rPr>
-            </w:r>
-            <w:r>
-              <w:rPr>
-                <w:noProof/>
-              </w:rPr>
               <w:fldChar w:fldCharType="separate"/>
-            </w:r>
-            <w:r>
-              <w:rPr>
-                <w:noProof/>
-              </w:rPr>
               <w:t>4</w:t>
-            </w:r>
-            <w:r>
-              <w:rPr>
-                <w:noProof/>
-              </w:rPr>
               <w:fldChar w:fldCharType="end"/>
             </w:r>
           </w:hyperlink>
@@ -513,40 +315,10 @@
                 <w:noProof/>
               </w:rPr>
               <w:tab/>
-            </w:r>
-            <w:r>
-              <w:rPr>
-                <w:noProof/>
-              </w:rPr>
               <w:fldChar w:fldCharType="begin"/>
-            </w:r>
-            <w:r>
-              <w:rPr>
-                <w:noProof/>
-              </w:rPr>
               <w:instrText xml:space="preserve"> PAGEREF _Toc238017022 \h </w:instrText>
-            </w:r>
-            <w:r>
-              <w:rPr>
-                <w:noProof/>
-              </w:rPr>
-            </w:r>
-            <w:r>
-              <w:rPr>
-                <w:noProof/>
-              </w:rPr>
               <w:fldChar w:fldCharType="separate"/>
-            </w:r>
-            <w:r>
-              <w:rPr>
-                <w:noProof/>
-              </w:rPr>
               <w:t>4</w:t>
-            </w:r>
-            <w:r>
-              <w:rPr>
-                <w:noProof/>
-              </w:rPr>
               <w:fldChar w:fldCharType="end"/>
             </w:r>
           </w:hyperlink>
@@ -569,47 +341,17 @@
                 <w:bCs/>
                 <w:noProof/>
               </w:rPr>
-              <w:t>6.2 Demanda ponderada 70/30</w:t>
+              <w:t>6.2 Demanda ponderada 50/30/20</w:t>
             </w:r>
             <w:r>
               <w:rPr>
                 <w:noProof/>
               </w:rPr>
               <w:tab/>
-            </w:r>
-            <w:r>
-              <w:rPr>
-                <w:noProof/>
-              </w:rPr>
               <w:fldChar w:fldCharType="begin"/>
-            </w:r>
-            <w:r>
-              <w:rPr>
-                <w:noProof/>
-              </w:rPr>
               <w:instrText xml:space="preserve"> PAGEREF _Toc238017023 \h </w:instrText>
-            </w:r>
-            <w:r>
-              <w:rPr>
-                <w:noProof/>
-              </w:rPr>
-            </w:r>
-            <w:r>
-              <w:rPr>
-                <w:noProof/>
-              </w:rPr>
               <w:fldChar w:fldCharType="separate"/>
-            </w:r>
-            <w:r>
-              <w:rPr>
-                <w:noProof/>
-              </w:rPr>
               <w:t>5</w:t>
-            </w:r>
-            <w:r>
-              <w:rPr>
-                <w:noProof/>
-              </w:rPr>
               <w:fldChar w:fldCharType="end"/>
             </w:r>
           </w:hyperlink>
@@ -639,40 +381,10 @@
                 <w:noProof/>
               </w:rPr>
               <w:tab/>
-            </w:r>
-            <w:r>
-              <w:rPr>
-                <w:noProof/>
-              </w:rPr>
               <w:fldChar w:fldCharType="begin"/>
-            </w:r>
-            <w:r>
-              <w:rPr>
-                <w:noProof/>
-              </w:rPr>
               <w:instrText xml:space="preserve"> PAGEREF _Toc238017024 \h </w:instrText>
-            </w:r>
-            <w:r>
-              <w:rPr>
-                <w:noProof/>
-              </w:rPr>
-            </w:r>
-            <w:r>
-              <w:rPr>
-                <w:noProof/>
-              </w:rPr>
               <w:fldChar w:fldCharType="separate"/>
-            </w:r>
-            <w:r>
-              <w:rPr>
-                <w:noProof/>
-              </w:rPr>
               <w:t>5</w:t>
-            </w:r>
-            <w:r>
-              <w:rPr>
-                <w:noProof/>
-              </w:rPr>
               <w:fldChar w:fldCharType="end"/>
             </w:r>
           </w:hyperlink>
@@ -702,40 +414,10 @@
                 <w:noProof/>
               </w:rPr>
               <w:tab/>
-            </w:r>
-            <w:r>
-              <w:rPr>
-                <w:noProof/>
-              </w:rPr>
               <w:fldChar w:fldCharType="begin"/>
-            </w:r>
-            <w:r>
-              <w:rPr>
-                <w:noProof/>
-              </w:rPr>
               <w:instrText xml:space="preserve"> PAGEREF _Toc238017025 \h </w:instrText>
-            </w:r>
-            <w:r>
-              <w:rPr>
-                <w:noProof/>
-              </w:rPr>
-            </w:r>
-            <w:r>
-              <w:rPr>
-                <w:noProof/>
-              </w:rPr>
               <w:fldChar w:fldCharType="separate"/>
-            </w:r>
-            <w:r>
-              <w:rPr>
-                <w:noProof/>
-              </w:rPr>
               <w:t>5</w:t>
-            </w:r>
-            <w:r>
-              <w:rPr>
-                <w:noProof/>
-              </w:rPr>
               <w:fldChar w:fldCharType="end"/>
             </w:r>
           </w:hyperlink>
@@ -765,40 +447,10 @@
                 <w:noProof/>
               </w:rPr>
               <w:tab/>
-            </w:r>
-            <w:r>
-              <w:rPr>
-                <w:noProof/>
-              </w:rPr>
               <w:fldChar w:fldCharType="begin"/>
-            </w:r>
-            <w:r>
-              <w:rPr>
-                <w:noProof/>
-              </w:rPr>
               <w:instrText xml:space="preserve"> PAGEREF _Toc238017026 \h </w:instrText>
-            </w:r>
-            <w:r>
-              <w:rPr>
-                <w:noProof/>
-              </w:rPr>
-            </w:r>
-            <w:r>
-              <w:rPr>
-                <w:noProof/>
-              </w:rPr>
               <w:fldChar w:fldCharType="separate"/>
-            </w:r>
-            <w:r>
-              <w:rPr>
-                <w:noProof/>
-              </w:rPr>
               <w:t>5</w:t>
-            </w:r>
-            <w:r>
-              <w:rPr>
-                <w:noProof/>
-              </w:rPr>
               <w:fldChar w:fldCharType="end"/>
             </w:r>
           </w:hyperlink>
@@ -828,40 +480,10 @@
                 <w:noProof/>
               </w:rPr>
               <w:tab/>
-            </w:r>
-            <w:r>
-              <w:rPr>
-                <w:noProof/>
-              </w:rPr>
               <w:fldChar w:fldCharType="begin"/>
-            </w:r>
-            <w:r>
-              <w:rPr>
-                <w:noProof/>
-              </w:rPr>
               <w:instrText xml:space="preserve"> PAGEREF _Toc238017027 \h </w:instrText>
-            </w:r>
-            <w:r>
-              <w:rPr>
-                <w:noProof/>
-              </w:rPr>
-            </w:r>
-            <w:r>
-              <w:rPr>
-                <w:noProof/>
-              </w:rPr>
               <w:fldChar w:fldCharType="separate"/>
-            </w:r>
-            <w:r>
-              <w:rPr>
-                <w:noProof/>
-              </w:rPr>
               <w:t>5</w:t>
-            </w:r>
-            <w:r>
-              <w:rPr>
-                <w:noProof/>
-              </w:rPr>
               <w:fldChar w:fldCharType="end"/>
             </w:r>
           </w:hyperlink>
@@ -891,40 +513,10 @@
                 <w:noProof/>
               </w:rPr>
               <w:tab/>
-            </w:r>
-            <w:r>
-              <w:rPr>
-                <w:noProof/>
-              </w:rPr>
               <w:fldChar w:fldCharType="begin"/>
-            </w:r>
-            <w:r>
-              <w:rPr>
-                <w:noProof/>
-              </w:rPr>
               <w:instrText xml:space="preserve"> PAGEREF _Toc238017028 \h </w:instrText>
-            </w:r>
-            <w:r>
-              <w:rPr>
-                <w:noProof/>
-              </w:rPr>
-            </w:r>
-            <w:r>
-              <w:rPr>
-                <w:noProof/>
-              </w:rPr>
               <w:fldChar w:fldCharType="separate"/>
-            </w:r>
-            <w:r>
-              <w:rPr>
-                <w:noProof/>
-              </w:rPr>
               <w:t>6</w:t>
-            </w:r>
-            <w:r>
-              <w:rPr>
-                <w:noProof/>
-              </w:rPr>
               <w:fldChar w:fldCharType="end"/>
             </w:r>
           </w:hyperlink>
@@ -954,40 +546,10 @@
                 <w:noProof/>
               </w:rPr>
               <w:tab/>
-            </w:r>
-            <w:r>
-              <w:rPr>
-                <w:noProof/>
-              </w:rPr>
               <w:fldChar w:fldCharType="begin"/>
-            </w:r>
-            <w:r>
-              <w:rPr>
-                <w:noProof/>
-              </w:rPr>
               <w:instrText xml:space="preserve"> PAGEREF _Toc238017029 \h </w:instrText>
-            </w:r>
-            <w:r>
-              <w:rPr>
-                <w:noProof/>
-              </w:rPr>
-            </w:r>
-            <w:r>
-              <w:rPr>
-                <w:noProof/>
-              </w:rPr>
               <w:fldChar w:fldCharType="separate"/>
-            </w:r>
-            <w:r>
-              <w:rPr>
-                <w:noProof/>
-              </w:rPr>
               <w:t>6</w:t>
-            </w:r>
-            <w:r>
-              <w:rPr>
-                <w:noProof/>
-              </w:rPr>
               <w:fldChar w:fldCharType="end"/>
             </w:r>
           </w:hyperlink>
@@ -1017,40 +579,10 @@
                 <w:noProof/>
               </w:rPr>
               <w:tab/>
-            </w:r>
-            <w:r>
-              <w:rPr>
-                <w:noProof/>
-              </w:rPr>
               <w:fldChar w:fldCharType="begin"/>
-            </w:r>
-            <w:r>
-              <w:rPr>
-                <w:noProof/>
-              </w:rPr>
               <w:instrText xml:space="preserve"> PAGEREF _Toc238017030 \h </w:instrText>
-            </w:r>
-            <w:r>
-              <w:rPr>
-                <w:noProof/>
-              </w:rPr>
-            </w:r>
-            <w:r>
-              <w:rPr>
-                <w:noProof/>
-              </w:rPr>
               <w:fldChar w:fldCharType="separate"/>
-            </w:r>
-            <w:r>
-              <w:rPr>
-                <w:noProof/>
-              </w:rPr>
               <w:t>6</w:t>
-            </w:r>
-            <w:r>
-              <w:rPr>
-                <w:noProof/>
-              </w:rPr>
               <w:fldChar w:fldCharType="end"/>
             </w:r>
           </w:hyperlink>
@@ -1080,40 +612,10 @@
                 <w:noProof/>
               </w:rPr>
               <w:tab/>
-            </w:r>
-            <w:r>
-              <w:rPr>
-                <w:noProof/>
-              </w:rPr>
               <w:fldChar w:fldCharType="begin"/>
-            </w:r>
-            <w:r>
-              <w:rPr>
-                <w:noProof/>
-              </w:rPr>
               <w:instrText xml:space="preserve"> PAGEREF _Toc238017031 \h </w:instrText>
-            </w:r>
-            <w:r>
-              <w:rPr>
-                <w:noProof/>
-              </w:rPr>
-            </w:r>
-            <w:r>
-              <w:rPr>
-                <w:noProof/>
-              </w:rPr>
               <w:fldChar w:fldCharType="separate"/>
-            </w:r>
-            <w:r>
-              <w:rPr>
-                <w:noProof/>
-              </w:rPr>
               <w:t>6</w:t>
-            </w:r>
-            <w:r>
-              <w:rPr>
-                <w:noProof/>
-              </w:rPr>
               <w:fldChar w:fldCharType="end"/>
             </w:r>
           </w:hyperlink>
@@ -1170,37 +672,7 @@
           <w:sz w:val="22"/>
           <w:szCs w:val="22"/>
         </w:rPr>
-        <w:t>El sistema recibe seis archivos de Excel (</w:t>
-      </w:r>
-      <w:r>
-        <w:rPr>
-          <w:sz w:val="22"/>
-          <w:szCs w:val="22"/>
-        </w:rPr>
-        <w:t>Maestro</w:t>
-      </w:r>
-      <w:r>
-        <w:rPr>
-          <w:sz w:val="22"/>
-          <w:szCs w:val="22"/>
-        </w:rPr>
-        <w:t>, consumos, inventarios y moléculas), los procesa y produce como resultado un archivo de Excel con la proyección detallada, además de un panel (</w:t>
-      </w:r>
-      <w:proofErr w:type="spellStart"/>
-      <w:r>
-        <w:rPr>
-          <w:sz w:val="22"/>
-          <w:szCs w:val="22"/>
-        </w:rPr>
-        <w:t>dashboard</w:t>
-      </w:r>
-      <w:proofErr w:type="spellEnd"/>
-      <w:r>
-        <w:rPr>
-          <w:sz w:val="22"/>
-          <w:szCs w:val="22"/>
-        </w:rPr>
-        <w:t>) web con los indicadores principales y la tabla de proveedores.</w:t>
+        <w:t>El sistema recibe seis archivos de Excel (Maestro, consumos, inventarios y moléculas), los procesa y produce como resultado un archivo de Excel con la proyección detallada, además de un panel (dashboard) web con los indicadores principales y la tabla de proveedores.</w:t>
       </w:r>
     </w:p>
     <w:p>
@@ -1249,27 +721,7 @@
           <w:sz w:val="22"/>
           <w:szCs w:val="22"/>
         </w:rPr>
-        <w:t xml:space="preserve">6 archivos de Excel (Maestro, Dispensación, Remisiones, Valorizado CEDI, Valorizado Puntos y </w:t>
-      </w:r>
-      <w:proofErr w:type="spellStart"/>
-      <w:r>
-        <w:rPr>
-          <w:b/>
-          <w:bCs/>
-          <w:sz w:val="22"/>
-          <w:szCs w:val="22"/>
-        </w:rPr>
-        <w:t>Molécula_Compra</w:t>
-      </w:r>
-      <w:proofErr w:type="spellEnd"/>
-      <w:r>
-        <w:rPr>
-          <w:b/>
-          <w:bCs/>
-          <w:sz w:val="22"/>
-          <w:szCs w:val="22"/>
-        </w:rPr>
-        <w:t xml:space="preserve">).: </w:t>
+        <w:t xml:space="preserve">6 archivos de Excel (Maestro, Dispensación, Remisiones, Valorizado CEDI, Valorizado Puntos y Molécula_Compra).: </w:t>
       </w:r>
       <w:r>
         <w:rPr>
@@ -1321,27 +773,7 @@
           <w:sz w:val="22"/>
           <w:szCs w:val="22"/>
         </w:rPr>
-        <w:t xml:space="preserve">un Excel con 6 hojas (proyección por producto y por molécula, con distintos modelos de descuento de inventario) y un </w:t>
-      </w:r>
-      <w:proofErr w:type="spellStart"/>
-      <w:r>
-        <w:rPr>
-          <w:b/>
-          <w:bCs/>
-          <w:sz w:val="22"/>
-          <w:szCs w:val="22"/>
-        </w:rPr>
-        <w:t>dashboard</w:t>
-      </w:r>
-      <w:proofErr w:type="spellEnd"/>
-      <w:r>
-        <w:rPr>
-          <w:b/>
-          <w:bCs/>
-          <w:sz w:val="22"/>
-          <w:szCs w:val="22"/>
-        </w:rPr>
-        <w:t xml:space="preserve"> web con indicadores y proveedores.: </w:t>
+        <w:t xml:space="preserve">un Excel con 6 hojas (proyección por producto y por molécula, con distintos modelos de descuento de inventario) y un dashboard web con indicadores y proveedores.: </w:t>
       </w:r>
       <w:r>
         <w:rPr>
@@ -1802,11 +1234,9 @@
             </w:tcMar>
           </w:tcPr>
           <w:p>
-            <w:proofErr w:type="spellStart"/>
             <w:r>
               <w:t>Molécula_Compra</w:t>
             </w:r>
-            <w:proofErr w:type="spellEnd"/>
           </w:p>
         </w:tc>
         <w:tc>
@@ -1862,27 +1292,7 @@
           <w:szCs w:val="22"/>
         </w:rPr>
         <w:lastRenderedPageBreak/>
-        <w:t xml:space="preserve">El lector de archivos es tolerante al formato: busca la fila del encabezado por su nombre (no por posición), así que soporta reportes con filas de título arriba o columnas corridas. También </w:t>
-      </w:r>
-      <w:proofErr w:type="spellStart"/>
-      <w:r>
-        <w:rPr>
-          <w:i/>
-          <w:iCs/>
-          <w:sz w:val="22"/>
-          <w:szCs w:val="22"/>
-        </w:rPr>
-        <w:t>deduplica</w:t>
-      </w:r>
-      <w:proofErr w:type="spellEnd"/>
-      <w:r>
-        <w:rPr>
-          <w:i/>
-          <w:iCs/>
-          <w:sz w:val="22"/>
-          <w:szCs w:val="22"/>
-        </w:rPr>
-        <w:t xml:space="preserve"> el Maestro y las Moléculas por código para no multiplicar filas.</w:t>
+        <w:t xml:space="preserve">El lector de archivos es tolerante al formato: busca la fila del encabezado por su nombre (no por posición), así que soporta reportes con filas de título arriba o columnas corridas. También deduplica el Maestro y las Moléculas por código para no multiplicar filas.</w:t>
       </w:r>
     </w:p>
     <w:p>
@@ -2014,15 +1424,7 @@
           </w:tcPr>
           <w:p>
             <w:r>
-              <w:t xml:space="preserve">Motor de cálculo. Contiene la clase </w:t>
-            </w:r>
-            <w:proofErr w:type="spellStart"/>
-            <w:r>
-              <w:t>ProyeccionProcessor</w:t>
-            </w:r>
-            <w:proofErr w:type="spellEnd"/>
-            <w:r>
-              <w:t xml:space="preserve"> con toda la lógica: limpieza, clasificación, consolidación, rotación y pedido.</w:t>
+              <w:t xml:space="preserve">Motor de cálculo. Contiene la clase ProyeccionProcessor con toda la lógica: limpieza, clasificación, consolidación, rotación y pedido.</w:t>
             </w:r>
           </w:p>
         </w:tc>
@@ -2146,23 +1548,7 @@
           </w:tcPr>
           <w:p>
             <w:r>
-              <w:t>Aplicación web (</w:t>
-            </w:r>
-            <w:proofErr w:type="spellStart"/>
-            <w:r>
-              <w:t>FastAPI</w:t>
-            </w:r>
-            <w:proofErr w:type="spellEnd"/>
-            <w:r>
-              <w:t xml:space="preserve">): sube archivos, ajusta parámetros, genera el </w:t>
-            </w:r>
-            <w:proofErr w:type="spellStart"/>
-            <w:r>
-              <w:t>dashboard</w:t>
-            </w:r>
-            <w:proofErr w:type="spellEnd"/>
-            <w:r>
-              <w:t xml:space="preserve"> y descarga el Excel.</w:t>
+              <w:t xml:space="preserve">Aplicación web (FastAPI): sube archivos, ajusta parámetros, genera el dashboard y descarga el Excel.</w:t>
             </w:r>
           </w:p>
         </w:tc>
@@ -2186,6 +1572,46 @@
           </w:tcPr>
           <w:p>
             <w:r>
+              <w:t>db.py</w:t>
+            </w:r>
+          </w:p>
+        </w:tc>
+        <w:tc>
+          <w:tcPr>
+            <w:tcW w:w="7160" w:type="dxa"/>
+            <w:tcMar>
+              <w:top w:w="60" w:type="dxa"/>
+              <w:left w:w="110" w:type="dxa"/>
+              <w:bottom w:w="60" w:type="dxa"/>
+              <w:right w:w="110" w:type="dxa"/>
+            </w:tcMar>
+          </w:tcPr>
+          <w:p>
+            <w:r>
+              <w:t xml:space="preserve">Capa de datos (MySQL). Conecta con la base de datos y ejecuta las consultas de consumo (dispensación y remisiones) del módulo Consumos. Solo la usa la aplicación web.</w:t>
+            </w:r>
+          </w:p>
+        </w:tc>
+      </w:tr>
+      <w:tr>
+        <w:tblPrEx>
+          <w:tblCellMar>
+            <w:top w:w="0" w:type="dxa"/>
+            <w:bottom w:w="0" w:type="dxa"/>
+          </w:tblCellMar>
+        </w:tblPrEx>
+        <w:tc>
+          <w:tcPr>
+            <w:tcW w:w="2200" w:type="dxa"/>
+            <w:tcMar>
+              <w:top w:w="60" w:type="dxa"/>
+              <w:left w:w="110" w:type="dxa"/>
+              <w:bottom w:w="60" w:type="dxa"/>
+              <w:right w:w="110" w:type="dxa"/>
+            </w:tcMar>
+          </w:tcPr>
+          <w:p>
+            <w:r>
               <w:t>app.py</w:t>
             </w:r>
           </w:p>
@@ -2202,15 +1628,7 @@
           </w:tcPr>
           <w:p>
             <w:r>
-              <w:t xml:space="preserve">Versión anterior de la interfaz, hecha en </w:t>
-            </w:r>
-            <w:proofErr w:type="spellStart"/>
-            <w:r>
-              <w:t>Streamlit</w:t>
-            </w:r>
-            <w:proofErr w:type="spellEnd"/>
-            <w:r>
-              <w:t xml:space="preserve"> (heredada). El motor es el mismo; la interfaz vigente es web.py.</w:t>
+              <w:t xml:space="preserve">Versión anterior de la interfaz, hecha en Streamlit (heredada). El motor es el mismo; la interfaz vigente es web.py.</w:t>
             </w:r>
           </w:p>
         </w:tc>
@@ -2243,23 +1661,7 @@
           <w:sz w:val="22"/>
           <w:szCs w:val="22"/>
         </w:rPr>
-        <w:t xml:space="preserve">Al llamar a </w:t>
-      </w:r>
-      <w:proofErr w:type="gramStart"/>
-      <w:r>
-        <w:rPr>
-          <w:sz w:val="22"/>
-          <w:szCs w:val="22"/>
-        </w:rPr>
-        <w:t>procesar(</w:t>
-      </w:r>
-      <w:proofErr w:type="gramEnd"/>
-      <w:r>
-        <w:rPr>
-          <w:sz w:val="22"/>
-          <w:szCs w:val="22"/>
-        </w:rPr>
-        <w:t>), el motor ejecuta estos pasos en orden. Cada uno deja listos los datos para el siguiente:</w:t>
+        <w:t xml:space="preserve">Al llamar a procesar(), el motor ejecuta estos pasos en orden. Cada uno deja listos los datos para el siguiente:</w:t>
       </w:r>
     </w:p>
     <w:p>
@@ -2278,50 +1680,14 @@
           <w:sz w:val="22"/>
           <w:szCs w:val="22"/>
         </w:rPr>
-        <w:t>Limpieza (</w:t>
-      </w:r>
-      <w:proofErr w:type="spellStart"/>
-      <w:r>
-        <w:rPr>
-          <w:b/>
-          <w:bCs/>
-          <w:sz w:val="22"/>
-          <w:szCs w:val="22"/>
-        </w:rPr>
-        <w:t>limpiar_datos</w:t>
-      </w:r>
-      <w:proofErr w:type="spellEnd"/>
-      <w:r>
-        <w:rPr>
-          <w:b/>
-          <w:bCs/>
-          <w:sz w:val="22"/>
-          <w:szCs w:val="22"/>
-        </w:rPr>
-        <w:t xml:space="preserve">): </w:t>
-      </w:r>
-      <w:r>
-        <w:rPr>
-          <w:sz w:val="22"/>
-          <w:szCs w:val="22"/>
-        </w:rPr>
-        <w:t xml:space="preserve">Se normalizan textos y códigos, se </w:t>
-      </w:r>
-      <w:proofErr w:type="spellStart"/>
-      <w:r>
-        <w:rPr>
-          <w:sz w:val="22"/>
-          <w:szCs w:val="22"/>
-        </w:rPr>
-        <w:t>deduplica</w:t>
-      </w:r>
-      <w:proofErr w:type="spellEnd"/>
-      <w:r>
-        <w:rPr>
-          <w:sz w:val="22"/>
-          <w:szCs w:val="22"/>
-        </w:rPr>
-        <w:t xml:space="preserve"> el Maestro y las Moléculas, se excluyen los códigos que no son productos y se alinean los períodos de ambos canales.</w:t>
+        <w:t xml:space="preserve">Limpieza (limpiar_datos): </w:t>
+      </w:r>
+      <w:r>
+        <w:rPr>
+          <w:sz w:val="22"/>
+          <w:szCs w:val="22"/>
+        </w:rPr>
+        <w:t xml:space="preserve">Se normalizan textos y códigos, se deduplica el Maestro y las Moléculas, se excluyen los códigos que no son productos y se alinean los períodos de ambos canales.</w:t>
       </w:r>
     </w:p>
     <w:p>
@@ -2340,27 +1706,7 @@
           <w:sz w:val="22"/>
           <w:szCs w:val="22"/>
         </w:rPr>
-        <w:t>Clasificación (</w:t>
-      </w:r>
-      <w:proofErr w:type="spellStart"/>
-      <w:r>
-        <w:rPr>
-          <w:b/>
-          <w:bCs/>
-          <w:sz w:val="22"/>
-          <w:szCs w:val="22"/>
-        </w:rPr>
-        <w:t>clasificar_segmentos</w:t>
-      </w:r>
-      <w:proofErr w:type="spellEnd"/>
-      <w:r>
-        <w:rPr>
-          <w:b/>
-          <w:bCs/>
-          <w:sz w:val="22"/>
-          <w:szCs w:val="22"/>
-        </w:rPr>
-        <w:t xml:space="preserve">): </w:t>
+        <w:t xml:space="preserve">Clasificación (clasificar_segmentos): </w:t>
       </w:r>
       <w:r>
         <w:rPr>
@@ -2386,76 +1732,14 @@
           <w:sz w:val="22"/>
           <w:szCs w:val="22"/>
         </w:rPr>
-        <w:t>Demanda (</w:t>
-      </w:r>
-      <w:proofErr w:type="spellStart"/>
-      <w:r>
-        <w:rPr>
-          <w:b/>
-          <w:bCs/>
-          <w:sz w:val="22"/>
-          <w:szCs w:val="22"/>
-        </w:rPr>
-        <w:t>calcular_ponderados</w:t>
-      </w:r>
-      <w:proofErr w:type="spellEnd"/>
-      <w:r>
-        <w:rPr>
-          <w:b/>
-          <w:bCs/>
-          <w:sz w:val="22"/>
-          <w:szCs w:val="22"/>
-        </w:rPr>
-        <w:t xml:space="preserve">): </w:t>
-      </w:r>
-      <w:r>
-        <w:rPr>
-          <w:sz w:val="22"/>
-          <w:szCs w:val="22"/>
-        </w:rPr>
-        <w:t xml:space="preserve">Se calcula la demanda mensual ponderada </w:t>
-      </w:r>
-      <w:r>
-        <w:rPr>
-          <w:sz w:val="22"/>
-          <w:szCs w:val="22"/>
-        </w:rPr>
-        <w:t>5</w:t>
-      </w:r>
-      <w:r>
-        <w:rPr>
-          <w:sz w:val="22"/>
-          <w:szCs w:val="22"/>
-        </w:rPr>
-        <w:t>0/30</w:t>
-      </w:r>
-      <w:r>
-        <w:rPr>
-          <w:sz w:val="22"/>
-          <w:szCs w:val="22"/>
-        </w:rPr>
-        <w:t>/20</w:t>
-      </w:r>
-      <w:r>
-        <w:rPr>
-          <w:sz w:val="22"/>
-          <w:szCs w:val="22"/>
-        </w:rPr>
-        <w:t xml:space="preserve"> (los últimos 3 meses pesan </w:t>
-      </w:r>
-      <w:r>
-        <w:rPr>
-          <w:sz w:val="22"/>
-          <w:szCs w:val="22"/>
-        </w:rPr>
-        <w:t>10</w:t>
-      </w:r>
-      <w:r>
-        <w:rPr>
-          <w:sz w:val="22"/>
-          <w:szCs w:val="22"/>
-        </w:rPr>
-        <w:t>0 %) para cada canal.</w:t>
+        <w:t xml:space="preserve">Demanda (calcular_ponderados): </w:t>
+      </w:r>
+      <w:r>
+        <w:rPr>
+          <w:sz w:val="22"/>
+          <w:szCs w:val="22"/>
+        </w:rPr>
+        <w:t xml:space="preserve">Se calcula la demanda mensual ponderada 50/30/20 (los últimos 3 meses pesan 100 %) para cada canal.</w:t>
       </w:r>
     </w:p>
     <w:p>
@@ -2474,27 +1758,7 @@
           <w:sz w:val="22"/>
           <w:szCs w:val="22"/>
         </w:rPr>
-        <w:t>Consolidación (</w:t>
-      </w:r>
-      <w:proofErr w:type="spellStart"/>
-      <w:r>
-        <w:rPr>
-          <w:b/>
-          <w:bCs/>
-          <w:sz w:val="22"/>
-          <w:szCs w:val="22"/>
-        </w:rPr>
-        <w:t>consolidar_consumos</w:t>
-      </w:r>
-      <w:proofErr w:type="spellEnd"/>
-      <w:r>
-        <w:rPr>
-          <w:b/>
-          <w:bCs/>
-          <w:sz w:val="22"/>
-          <w:szCs w:val="22"/>
-        </w:rPr>
-        <w:t xml:space="preserve">): </w:t>
+        <w:t xml:space="preserve">Consolidación (consolidar_consumos): </w:t>
       </w:r>
       <w:r>
         <w:rPr>
@@ -2546,27 +1810,7 @@
           <w:sz w:val="22"/>
           <w:szCs w:val="22"/>
         </w:rPr>
-        <w:t>Rotación (</w:t>
-      </w:r>
-      <w:proofErr w:type="spellStart"/>
-      <w:r>
-        <w:rPr>
-          <w:b/>
-          <w:bCs/>
-          <w:sz w:val="22"/>
-          <w:szCs w:val="22"/>
-        </w:rPr>
-        <w:t>calcular_rotacion</w:t>
-      </w:r>
-      <w:proofErr w:type="spellEnd"/>
-      <w:r>
-        <w:rPr>
-          <w:b/>
-          <w:bCs/>
-          <w:sz w:val="22"/>
-          <w:szCs w:val="22"/>
-        </w:rPr>
-        <w:t xml:space="preserve">): </w:t>
+        <w:t xml:space="preserve">Rotación (calcular_rotacion): </w:t>
       </w:r>
       <w:r>
         <w:rPr>
@@ -2592,47 +1836,7 @@
           <w:sz w:val="22"/>
           <w:szCs w:val="22"/>
         </w:rPr>
-        <w:t>Pedido (</w:t>
-      </w:r>
-      <w:proofErr w:type="spellStart"/>
-      <w:r>
-        <w:rPr>
-          <w:b/>
-          <w:bCs/>
-          <w:sz w:val="22"/>
-          <w:szCs w:val="22"/>
-        </w:rPr>
-        <w:t>calcular_pedido</w:t>
-      </w:r>
-      <w:proofErr w:type="spellEnd"/>
-      <w:r>
-        <w:rPr>
-          <w:b/>
-          <w:bCs/>
-          <w:sz w:val="22"/>
-          <w:szCs w:val="22"/>
-        </w:rPr>
-        <w:t xml:space="preserve"> / </w:t>
-      </w:r>
-      <w:proofErr w:type="spellStart"/>
-      <w:r>
-        <w:rPr>
-          <w:b/>
-          <w:bCs/>
-          <w:sz w:val="22"/>
-          <w:szCs w:val="22"/>
-        </w:rPr>
-        <w:t>pedido_por_canal</w:t>
-      </w:r>
-      <w:proofErr w:type="spellEnd"/>
-      <w:r>
-        <w:rPr>
-          <w:b/>
-          <w:bCs/>
-          <w:sz w:val="22"/>
-          <w:szCs w:val="22"/>
-        </w:rPr>
-        <w:t xml:space="preserve">): </w:t>
+        <w:t xml:space="preserve">Pedido (calcular_pedido / pedido_por_canal): </w:t>
       </w:r>
       <w:r>
         <w:rPr>
@@ -2741,31 +1945,15 @@
           <w:bCs/>
           <w:color w:val="2E7D32"/>
         </w:rPr>
-        <w:t xml:space="preserve">6.2 Demanda ponderada </w:t>
-      </w:r>
+        <w:t xml:space="preserve">6.2 Demanda ponderada 50/30</w:t>
+      </w:r>
+      <w:bookmarkEnd w:id="7"/>
       <w:r>
         <w:rPr>
           <w:b/>
           <w:bCs/>
           <w:color w:val="2E7D32"/>
         </w:rPr>
-        <w:t>5</w:t>
-      </w:r>
-      <w:r>
-        <w:rPr>
-          <w:b/>
-          <w:bCs/>
-          <w:color w:val="2E7D32"/>
-        </w:rPr>
-        <w:t>0/30</w:t>
-      </w:r>
-      <w:bookmarkEnd w:id="7"/>
-      <w:r>
-        <w:rPr>
-          <w:b/>
-          <w:bCs/>
-          <w:color w:val="2E7D32"/>
-        </w:rPr>
         <w:t>/20</w:t>
       </w:r>
     </w:p>
@@ -2778,21 +1966,7 @@
           <w:sz w:val="22"/>
           <w:szCs w:val="22"/>
         </w:rPr>
-        <w:t xml:space="preserve">La demanda mensual no es un promedio simple: da más peso a los meses recientes (50/30/20 sobre los últimos tres, que suman el </w:t>
-      </w:r>
-      <w:r>
-        <w:rPr>
-          <w:sz w:val="22"/>
-          <w:szCs w:val="22"/>
-        </w:rPr>
-        <w:t>10</w:t>
-      </w:r>
-      <w:r>
-        <w:rPr>
-          <w:sz w:val="22"/>
-          <w:szCs w:val="22"/>
-        </w:rPr>
-        <w:t>0 % frente al 0 % de los tres anteriores). Así reacciona antes a los cambios de consumo.</w:t>
+        <w:t xml:space="preserve">La demanda mensual no es un promedio simple: da más peso a los meses recientes (50/30/20 sobre los últimos tres, que suman el 100 % frente al 0 % de los tres anteriores). Así reacciona antes a los cambios de consumo.</w:t>
       </w:r>
     </w:p>
     <w:p>
@@ -2876,23 +2050,7 @@
           <w:sz w:val="22"/>
           <w:szCs w:val="22"/>
         </w:rPr>
-        <w:t xml:space="preserve">El sistema entrega tres cálculos del pedido, según qué inventario se descuenta. En el </w:t>
-      </w:r>
-      <w:proofErr w:type="spellStart"/>
-      <w:r>
-        <w:rPr>
-          <w:sz w:val="22"/>
-          <w:szCs w:val="22"/>
-        </w:rPr>
-        <w:t>dashboard</w:t>
-      </w:r>
-      <w:proofErr w:type="spellEnd"/>
-      <w:r>
-        <w:rPr>
-          <w:sz w:val="22"/>
-          <w:szCs w:val="22"/>
-        </w:rPr>
-        <w:t xml:space="preserve"> son las tres tarjetas:</w:t>
+        <w:t xml:space="preserve">El sistema entrega tres cálculos del pedido, según qué inventario se descuenta. En el dashboard son las tres tarjetas:</w:t>
       </w:r>
     </w:p>
     <w:tbl>
@@ -3094,6 +2252,58 @@
         </w:tc>
       </w:tr>
     </w:tbl>
+    <w:p>
+      <w:pPr>
+        <w:pStyle w:val="Ttulo2"/>
+        <w:spacing w:before="220" w:after="100"/>
+      </w:pPr>
+      <w:r>
+        <w:rPr>
+          <w:b/>
+          <w:bCs/>
+          <w:color w:val="2E7D32"/>
+        </w:rPr>
+        <w:t>6.6 Último mes solo visual</w:t>
+      </w:r>
+    </w:p>
+    <w:p>
+      <w:pPr>
+        <w:spacing w:after="120" w:line="276" w:lineRule="auto"/>
+      </w:pPr>
+      <w:r>
+        <w:rPr>
+          <w:sz w:val="22"/>
+          <w:szCs w:val="22"/>
+        </w:rPr>
+        <w:t xml:space="preserve">El mes más reciente de los archivos de consumo puede apartarse para que aparezca en el Excel solo como referencia, sin entrar en la demanda, la rotación ni el pedido. Se controla con el parámetro APARTAR_ULTIMO_MES_VISUAL en config.py. Sirve para ver el consumo del mes en curso (todavía incompleto) sin que distorsione los cálculos, que quedan basados en los meses ya cerrados.</w:t>
+      </w:r>
+    </w:p>
+    <w:p>
+      <w:pPr>
+        <w:pStyle w:val="Ttulo2"/>
+        <w:spacing w:before="220" w:after="100"/>
+      </w:pPr>
+      <w:r>
+        <w:rPr>
+          <w:b/>
+          <w:bCs/>
+          <w:color w:val="2E7D32"/>
+        </w:rPr>
+        <w:t>6.7 Redondeo por empaque</w:t>
+      </w:r>
+    </w:p>
+    <w:p>
+      <w:pPr>
+        <w:spacing w:after="120" w:line="276" w:lineRule="auto"/>
+      </w:pPr>
+      <w:r>
+        <w:rPr>
+          <w:sz w:val="22"/>
+          <w:szCs w:val="22"/>
+        </w:rPr>
+        <w:t xml:space="preserve">Las cantidades a pedir se redondean al empaque de compra (cajas o presentaciones completas) para que el pedido sea realizable. El redondeo se aplica por canal y según la rotación del producto (A, M o B).</w:t>
+      </w:r>
+    </w:p>
     <w:p>
       <w:pPr>
         <w:pStyle w:val="Ttulo1"/>
@@ -3635,11 +2845,9 @@
             </w:tcMar>
           </w:tcPr>
           <w:p>
-            <w:proofErr w:type="spellStart"/>
             <w:r>
               <w:t>Dispensacion</w:t>
             </w:r>
-            <w:proofErr w:type="spellEnd"/>
           </w:p>
         </w:tc>
         <w:tc>
@@ -3842,11 +3050,9 @@
             </w:tcMar>
           </w:tcPr>
           <w:p>
-            <w:proofErr w:type="spellStart"/>
             <w:r>
               <w:t>Pedido_Molecula</w:t>
             </w:r>
-            <w:proofErr w:type="spellEnd"/>
           </w:p>
         </w:tc>
         <w:tc>
@@ -3868,6 +3074,18 @@
         </w:tc>
       </w:tr>
     </w:tbl>
+    <w:p>
+      <w:pPr>
+        <w:spacing w:after="120" w:line="276" w:lineRule="auto"/>
+      </w:pPr>
+      <w:r>
+        <w:rPr>
+          <w:sz w:val="22"/>
+          <w:szCs w:val="22"/>
+        </w:rPr>
+        <w:t xml:space="preserve">Además, todas las hojas incluyen la columna CATEGORIA (tomada del Maestro) para poder filtrar por tipo de producto. Y cuando está activo el «último mes solo visual», el consumo del mes más reciente aparece como columna informativa (por ejemplo, Consumo_Ago_2026) pero no interviene en ningún cálculo.</w:t>
+      </w:r>
+    </w:p>
     <w:p>
       <w:pPr>
         <w:pStyle w:val="Ttulo1"/>
@@ -3895,7 +3113,7 @@
           <w:sz w:val="22"/>
           <w:szCs w:val="22"/>
         </w:rPr>
-        <w:t>La interfaz vigente (web.py) funciona así:</w:t>
+        <w:t>La aplicación tiene una pantalla de inicio y dos módulos, que se eligen en la barra superior: Proyección y Consumos. En el módulo Proyección se suben los seis archivos y se genera el resultado:</w:t>
       </w:r>
     </w:p>
     <w:p>
@@ -3929,23 +3147,7 @@
           <w:sz w:val="22"/>
           <w:szCs w:val="22"/>
         </w:rPr>
-        <w:t xml:space="preserve">El botón «Generar </w:t>
-      </w:r>
-      <w:proofErr w:type="spellStart"/>
-      <w:r>
-        <w:rPr>
-          <w:sz w:val="22"/>
-          <w:szCs w:val="22"/>
-        </w:rPr>
-        <w:t>Dashboard</w:t>
-      </w:r>
-      <w:proofErr w:type="spellEnd"/>
-      <w:r>
-        <w:rPr>
-          <w:sz w:val="22"/>
-          <w:szCs w:val="22"/>
-        </w:rPr>
-        <w:t>» abre un panel con tres tarjetas (los tres modelos) y una tabla de proveedores. Al hacer clic en cada tarjeta, la tabla de proveedores se recalcula con las cifras de ese modelo.</w:t>
+        <w:t xml:space="preserve">El botón «Generar Dashboard» abre un panel con tres tarjetas (los tres modelos) y una tabla de proveedores. Al hacer clic en cada tarjeta, la tabla de proveedores se recalcula con las cifras de ese modelo.</w:t>
       </w:r>
     </w:p>
     <w:p>
@@ -3979,23 +3181,7 @@
           <w:sz w:val="22"/>
           <w:szCs w:val="22"/>
         </w:rPr>
-        <w:t xml:space="preserve">El </w:t>
-      </w:r>
-      <w:proofErr w:type="spellStart"/>
-      <w:r>
-        <w:rPr>
-          <w:sz w:val="22"/>
-          <w:szCs w:val="22"/>
-        </w:rPr>
-        <w:t>dashboard</w:t>
-      </w:r>
-      <w:proofErr w:type="spellEnd"/>
-      <w:r>
-        <w:rPr>
-          <w:sz w:val="22"/>
-          <w:szCs w:val="22"/>
-        </w:rPr>
-        <w:t xml:space="preserve"> vive en una URL propia, por lo que se puede recargar sin perderlo. El Excel se descarga desde esa misma sesión.</w:t>
+        <w:t xml:space="preserve">El dashboard vive en una URL propia, por lo que se puede recargar sin perderlo. El Excel se descarga desde esa misma sesión.</w:t>
       </w:r>
     </w:p>
     <w:p>
@@ -4012,23 +3198,19 @@
           <w:sz w:val="22"/>
           <w:szCs w:val="22"/>
         </w:rPr>
-        <w:t xml:space="preserve">Para no consumir memoria sin control, el servidor conserva solo los últimos 20 </w:t>
-      </w:r>
-      <w:proofErr w:type="spellStart"/>
-      <w:r>
-        <w:rPr>
-          <w:sz w:val="22"/>
-          <w:szCs w:val="22"/>
-        </w:rPr>
-        <w:t>dashboards</w:t>
-      </w:r>
-      <w:proofErr w:type="spellEnd"/>
-      <w:r>
-        <w:rPr>
-          <w:sz w:val="22"/>
-          <w:szCs w:val="22"/>
-        </w:rPr>
-        <w:t xml:space="preserve"> generados.</w:t>
+        <w:t xml:space="preserve">Para no consumir memoria sin control, el servidor conserva solo los últimos 20 dashboards generados.</w:t>
+      </w:r>
+    </w:p>
+    <w:p>
+      <w:pPr>
+        <w:spacing w:after="120" w:line="276" w:lineRule="auto"/>
+      </w:pPr>
+      <w:r>
+        <w:rPr>
+          <w:sz w:val="22"/>
+          <w:szCs w:val="22"/>
+        </w:rPr>
+        <w:t xml:space="preserve">En el módulo Consumos se descargan las rotaciones de consumo directamente desde la base de datos, sin subir archivos: se elige un rango de meses (desde / hasta) y se obtiene un Excel con el consumo de Dispensación o de Remisiones por período. La aplicación consulta los períodos disponibles en la base para guiar la selección del rango.</w:t>
       </w:r>
     </w:p>
     <w:p>
@@ -4182,71 +3364,7 @@
           <w:sz w:val="22"/>
           <w:szCs w:val="22"/>
         </w:rPr>
-        <w:t xml:space="preserve">La aplicación web corre sobre </w:t>
-      </w:r>
-      <w:proofErr w:type="spellStart"/>
-      <w:r>
-        <w:rPr>
-          <w:sz w:val="22"/>
-          <w:szCs w:val="22"/>
-        </w:rPr>
-        <w:t>FastAPI</w:t>
-      </w:r>
-      <w:proofErr w:type="spellEnd"/>
-      <w:r>
-        <w:rPr>
-          <w:sz w:val="22"/>
-          <w:szCs w:val="22"/>
-        </w:rPr>
-        <w:t xml:space="preserve"> y se sirve con </w:t>
-      </w:r>
-      <w:proofErr w:type="spellStart"/>
-      <w:r>
-        <w:rPr>
-          <w:sz w:val="22"/>
-          <w:szCs w:val="22"/>
-        </w:rPr>
-        <w:t>uvicorn</w:t>
-      </w:r>
-      <w:proofErr w:type="spellEnd"/>
-      <w:r>
-        <w:rPr>
-          <w:sz w:val="22"/>
-          <w:szCs w:val="22"/>
-        </w:rPr>
-        <w:t xml:space="preserve">. En el servidor (Windows Server) se ejecuta como servicio con </w:t>
-      </w:r>
-      <w:proofErr w:type="spellStart"/>
-      <w:r>
-        <w:rPr>
-          <w:sz w:val="22"/>
-          <w:szCs w:val="22"/>
-        </w:rPr>
-        <w:t>nssm</w:t>
-      </w:r>
-      <w:proofErr w:type="spellEnd"/>
-      <w:r>
-        <w:rPr>
-          <w:sz w:val="22"/>
-          <w:szCs w:val="22"/>
-        </w:rPr>
-        <w:t xml:space="preserve">, y el código se actualiza con </w:t>
-      </w:r>
-      <w:proofErr w:type="spellStart"/>
-      <w:r>
-        <w:rPr>
-          <w:sz w:val="22"/>
-          <w:szCs w:val="22"/>
-        </w:rPr>
-        <w:t>git</w:t>
-      </w:r>
-      <w:proofErr w:type="spellEnd"/>
-      <w:r>
-        <w:rPr>
-          <w:sz w:val="22"/>
-          <w:szCs w:val="22"/>
-        </w:rPr>
-        <w:t xml:space="preserve"> desde el repositorio. No requiere base de datos: toda la información entra por los archivos que se suben en cada ejecución.</w:t>
+        <w:t xml:space="preserve">La aplicación web corre sobre FastAPI y se sirve con uvicorn. En el servidor (Windows Server) se ejecuta como servicio con nssm, y el código se actualiza con git desde el repositorio. El módulo de Proyección no necesita base de datos (toda la información entra por los archivos que se suben en cada ejecución); el módulo de Consumos sí se conecta a la base de datos MySQL, cuya dirección se configura en la variable de entorno PROYECCION_DB_URL.</w:t>
       </w:r>
     </w:p>
     <w:p>
@@ -4302,16 +3420,7 @@
           <w:sz w:val="24"/>
           <w:szCs w:val="24"/>
         </w:rPr>
-        <w:t>Maestro:</w:t>
-      </w:r>
-      <w:r>
-        <w:rPr>
-          <w:b/>
-          <w:bCs/>
-          <w:sz w:val="24"/>
-          <w:szCs w:val="24"/>
-        </w:rPr>
-        <w:t xml:space="preserve"> </w:t>
+        <w:t xml:space="preserve">Maestro: </w:t>
       </w:r>
       <w:r>
         <w:rPr>
@@ -4375,16 +3484,7 @@
           <w:sz w:val="24"/>
           <w:szCs w:val="24"/>
         </w:rPr>
-        <w:t>-</w:t>
-      </w:r>
-      <w:r>
-        <w:rPr>
-          <w:b/>
-          <w:bCs/>
-          <w:sz w:val="24"/>
-          <w:szCs w:val="24"/>
-        </w:rPr>
-        <w:t>&gt;</w:t>
+        <w:t>-&gt;</w:t>
       </w:r>
       <w:r>
         <w:rPr>
@@ -4496,21 +3596,7 @@
           <w:sz w:val="24"/>
           <w:szCs w:val="24"/>
         </w:rPr>
-        <w:t xml:space="preserve"> BODEGA PRINCIPAL CEDI:</w:t>
-      </w:r>
-      <w:r>
-        <w:rPr>
-          <w:sz w:val="24"/>
-          <w:szCs w:val="24"/>
-        </w:rPr>
-        <w:t xml:space="preserve"> </w:t>
-      </w:r>
-      <w:r>
-        <w:rPr>
-          <w:sz w:val="24"/>
-          <w:szCs w:val="24"/>
-        </w:rPr>
-        <w:t xml:space="preserve">SI </w:t>
+        <w:t xml:space="preserve"> BODEGA PRINCIPAL CEDI: SI </w:t>
       </w:r>
       <w:r>
         <w:rPr>
@@ -4526,14 +3612,7 @@
           <w:sz w:val="24"/>
           <w:szCs w:val="24"/>
         </w:rPr>
-        <w:t xml:space="preserve"> Clase y Sub Clase: General</w:t>
-      </w:r>
-      <w:r>
-        <w:rPr>
-          <w:sz w:val="24"/>
-          <w:szCs w:val="24"/>
-        </w:rPr>
-        <w:t xml:space="preserve"> </w:t>
+        <w:t xml:space="preserve"> Clase y Sub Clase: General </w:t>
       </w:r>
       <w:r>
         <w:rPr>
@@ -4641,14 +3720,7 @@
           <w:sz w:val="24"/>
           <w:szCs w:val="24"/>
         </w:rPr>
-        <w:t xml:space="preserve"> Sucursal: Principal </w:t>
-      </w:r>
-      <w:r>
-        <w:rPr>
-          <w:sz w:val="24"/>
-          <w:szCs w:val="24"/>
-        </w:rPr>
-        <w:t xml:space="preserve">   </w:t>
+        <w:t xml:space="preserve"> Sucursal: Principal    </w:t>
       </w:r>
       <w:r>
         <w:rPr>
@@ -4794,30 +3866,14 @@
           <w:sz w:val="24"/>
           <w:szCs w:val="24"/>
         </w:rPr>
-        <w:t>–</w:t>
-      </w:r>
-      <w:r>
-        <w:rPr>
-          <w:b/>
-          <w:bCs/>
-          <w:sz w:val="24"/>
-          <w:szCs w:val="24"/>
-        </w:rPr>
-        <w:t>&gt;</w:t>
-      </w:r>
-      <w:r>
-        <w:rPr>
-          <w:sz w:val="24"/>
-          <w:szCs w:val="24"/>
-        </w:rPr>
-        <w:t xml:space="preserve"> Excel Stock Artículos, NIT, Bodega y Categoría</w:t>
-      </w:r>
-      <w:r>
-        <w:rPr>
-          <w:sz w:val="24"/>
-          <w:szCs w:val="24"/>
-        </w:rPr>
-        <w:t xml:space="preserve">. </w:t>
+        <w:t>–&gt;</w:t>
+      </w:r>
+      <w:r>
+        <w:rPr>
+          <w:sz w:val="24"/>
+          <w:szCs w:val="24"/>
+        </w:rPr>
+        <w:t xml:space="preserve"> Excel Stock Artículos, NIT, Bodega y Categoría. </w:t>
       </w:r>
       <w:hyperlink r:id="rId8" w:history="1">
         <w:r>
@@ -4912,37 +3968,7 @@
           <w:sz w:val="30"/>
           <w:szCs w:val="30"/>
         </w:rPr>
-        <w:t>1</w:t>
-      </w:r>
-      <w:r>
-        <w:rPr>
-          <w:b/>
-          <w:bCs/>
-          <w:color w:val="1B3A2B"/>
-          <w:sz w:val="30"/>
-          <w:szCs w:val="30"/>
-        </w:rPr>
-        <w:t>3</w:t>
-      </w:r>
-      <w:r>
-        <w:rPr>
-          <w:b/>
-          <w:bCs/>
-          <w:color w:val="1B3A2B"/>
-          <w:sz w:val="30"/>
-          <w:szCs w:val="30"/>
-        </w:rPr>
-        <w:t>. Link</w:t>
-      </w:r>
-      <w:r>
-        <w:rPr>
-          <w:b/>
-          <w:bCs/>
-          <w:color w:val="1B3A2B"/>
-          <w:sz w:val="30"/>
-          <w:szCs w:val="30"/>
-        </w:rPr>
-        <w:t xml:space="preserve"> </w:t>
+        <w:t xml:space="preserve">13. Link </w:t>
       </w:r>
     </w:p>
     <w:p>

</xml_diff>

<commit_message>
Feat: Se agrega nuevo modulo de INVENTARIOS - ABASTECIMIENTO: genera la rotación (consumo) sobre cantidades prescritas agrupadas por código, también trae la rotación (consumo) por código padre y total consumo padre. - Reparto: Genera la distribución de productos a corde al abastecimiento, cargando los siguientes archivos: Archivo Maestro, Archivo Consumo Abastecimiento, Archivo traslados en Transito y Archivo Detallado Compras (Unidades recibidas).
</commit_message>
<xml_diff>
--- a/Documentacion/Documentacion_Proyeccion_Compras.docx
+++ b/Documentacion/Documentacion_Proyeccion_Compras.docx
@@ -773,7 +773,7 @@
           <w:sz w:val="22"/>
           <w:szCs w:val="22"/>
         </w:rPr>
-        <w:t xml:space="preserve">un Excel con 6 hojas (proyección por producto y por molécula, con distintos modelos de descuento de inventario) y un dashboard web con indicadores y proveedores.: </w:t>
+        <w:t xml:space="preserve">un Excel con 7 hojas (proyección por producto y por molécula, con distintos modelos de descuento de inventario) y un dashboard web con indicadores y proveedores.: </w:t>
       </w:r>
       <w:r>
         <w:rPr>
@@ -2748,7 +2748,7 @@
           <w:sz w:val="22"/>
           <w:szCs w:val="22"/>
         </w:rPr>
-        <w:t>El Excel generado trae seis hojas. Cada fila lleva encima una descripción del origen del dato, y las celdas de compra se colorean para lectura rápida:</w:t>
+        <w:t>El Excel generado trae siete hojas. Cada fila lleva encima una descripción del origen del dato, y las celdas de compra se colorean para lectura rápida:</w:t>
       </w:r>
     </w:p>
     <w:tbl>
@@ -3084,6 +3084,12 @@
           <w:szCs w:val="22"/>
         </w:rPr>
         <w:t xml:space="preserve">Además, todas las hojas incluyen la columna CATEGORIA (tomada del Maestro) para poder filtrar por tipo de producto. Y cuando está activo el «último mes solo visual», el consumo del mes más reciente aparece como columna informativa (por ejemplo, Consumo_Ago_2026) pero no interviene en ningún cálculo.</w:t>
+      </w:r>
+    </w:p>
+    <w:p>
+      <w:pPr/>
+      <w:r>
+        <w:t>El archivo incluye además una hoja «Parámetros» que registra los valores usados en esa corrida: cobertura A/M/B, lead time y días de seguridad (por canal), umbrales de rotación ABC y la fecha de generación. Los toma del propio proceso, por lo que reflejan lo realmente aplicado (definido en config.py o en el formulario web). Sirve como evidencia de trazabilidad: cada Excel queda auto-documentado con los parámetros que produjeron sus resultados.</w:t>
       </w:r>
     </w:p>
     <w:p>

</xml_diff>